<commit_message>
feat: corrección Cap 81, adición de Capítulos 82 al 86 y compilación editorial
- Corrección canónica del Capítulo 81: cabello rojo encendido de Lortelle Kecheln.
- Capítulo 82: Convocatoria del Lord Comandante Valerick a las Ruinas Negras del Sur con 3.er año.
- Capítulo 83: El Consejo de los Cuatro Estandartes, suministros de Elte y despedida de Kaoruko.
- Capítulo 84: Convocatoria de Ken, despedida de Burnice y Lady Elysea, e inicio de la marcha.
- Capítulo 85: Campamento de los Cien Leones, General Alden y neutralización del Engendro de Miasma.
- Capítulo 86: Galerías de Ónix, Seikūken de Kenichi, purga del Ogro Rata y Primera Cámara Nodriza.
- Recompilación del Libro Maestro con 87 documentos en compilado/El_Camino_del_Reencarnado.docx.
- Actualización de CENSO_PERSONAJES.md, RESUMEN_HISTORIA.md, AUDITORIA_PERSONAJES.md y README.md.
</commit_message>
<xml_diff>
--- a/capitulos/81_Capitulo_81.docx
+++ b/capitulos/81_Capitulo_81.docx
@@ -444,7 +444,7 @@
           <w:color w:val="1C1C20"/>
           <w:sz w:val="22"/>
         </w:rPr>
-        <w:t>Estaba apoyada con indolente elegancia contra una balaustrada de mármol, sosteniendo un abanico de plumas esmeralda. Su cabello castaño claro con reflejos dorados caía en cascadas sedosas sobre sus hombros, enmarcando un rostro aristocrático de belleza felina y unos ojos verdes centelleantes que desbordaban inteligencia y coquetería. Llevaba un conjunto entallado de terciopelo verde bosque con un chaleco de brocado bordado en hilo de oro de la Compañía Elte, resaltando con descarada sofisticación las curvas de su busto y su cintura esbelta.</w:t>
+        <w:t>Estaba apoyada con indolente elegancia contra una balaustrada de mármol, sosteniendo un abanico de plumas esmeralda. Su vibrante cabello rojo encendido —una melena rojiza y sedosa con reflejos bermellón que resplandecía bajo la luz del sol— caía en suaves ondas sobre sus hombros, enmarcando un rostro aristocrático de belleza felina y unos ojos verdes centelleantes que desbordaban inteligencia y coquetería. Llevaba un conjunto entallado de terciopelo verde bosque con un chaleco de brocado bordado en hilo de oro de la Compañía Elte, resaltando con descarada sofisticación las curvas de su busto y su cintura esbelta.</w:t>
       </w:r>
     </w:p>
     <w:p>
@@ -514,7 +514,7 @@
           <w:color w:val="1C1C20"/>
           <w:sz w:val="22"/>
         </w:rPr>
-        <w:t>Giró sobre sus talones, rodeó mi cuello con ambos brazos y se alzó sobre las puntas de sus pies para estampar sus labios contra los míos. Fue un beso voraz, cálido y profundo, impregnado de ese perfume a sándalo y canela que me transportó de inmediato a las noches desinhibidas que habíamos compartido en la Costa Esmeralda. Sentí su cuerpo suave y ardiente presionarse contra el mío, mientras sus dedos acariciaban mi nuca con familiaridad posesiva.</w:t>
+        <w:t>Giró sobre sus talones, rodeó mi cuello con ambos brazos y se alzó sobre las puntas de sus pies para estampar sus labios contra los míos. Fue un beso voraz, cálido y profundo, impregnado de ese perfume a sándalo y canela que me transportó de inmediato a las noches desinhibidas que habíamos compartido en la Costa Esmeralda. Sentí su cuerpo suave y ardiente presionarse contra el mío, mientras sus dedos acariciaban mi nuca con familiaridad posesiva y sus mechones rojizos rozaban mi barbilla.</w:t>
       </w:r>
     </w:p>
     <w:p>

</xml_diff>